<commit_message>
Repair DOCX namespace metadata
</commit_message>
<xml_diff>
--- a/downloads/2026_V-LEAD_hatten_hennyu-chousahyo.docx
+++ b/downloads/2026_V-LEAD_hatten_hennyu-chousahyo.docx
@@ -1,6 +1,6 @@
 
 <file path=word/document.xml><?xml version="1.0" encoding="utf-8"?>
-<w:document xmlns:mc="http://schemas.openxmlformats.org/markup-compatibility/2006" xmlns:r="http://schemas.openxmlformats.org/officeDocument/2006/relationships" xmlns:w="http://schemas.openxmlformats.org/wordprocessingml/2006/main" xmlns:w14="http://schemas.microsoft.com/office/word/2010/wordml" mc:Ignorable="w14 w15 w16se w16cid w16 w16cex w16sdtdh w16sdtfl w16du wp14">
+<w:document xmlns:mc="http://schemas.openxmlformats.org/markup-compatibility/2006" xmlns:r="http://schemas.openxmlformats.org/officeDocument/2006/relationships" xmlns:w="http://schemas.openxmlformats.org/wordprocessingml/2006/main" xmlns:w14="http://schemas.microsoft.com/office/word/2010/wordml" xmlns:w15="http://schemas.microsoft.com/office/word/2012/wordml" xmlns:w16se="http://schemas.microsoft.com/office/word/2015/wordml/symex" xmlns:w16cid="http://schemas.microsoft.com/office/word/2016/wordml/cid" xmlns:w16="http://schemas.microsoft.com/office/word/2018/wordml" xmlns:w16cex="http://schemas.microsoft.com/office/word/2018/wordml/cex" xmlns:w16sdtdh="http://schemas.microsoft.com/office/word/2020/wordml/sdtdatahash" xmlns:w16sdtfl="http://schemas.microsoft.com/office/word/2024/wordml/sdtformatlock" xmlns:w16du="http://schemas.microsoft.com/office/word/2023/wordml/word16du" xmlns:wp14="http://schemas.microsoft.com/office/word/2010/wordprocessingDrawing" mc:Ignorable="w14 w15 w16se w16cid w16 w16cex w16sdtdh w16sdtfl w16du wp14">
   <w:body>
     <w:p>
       <w:pPr>
@@ -1328,7 +1328,7 @@
 </file>
 
 <file path=word/endnotes.xml><?xml version="1.0" encoding="utf-8"?>
-<w:endnotes xmlns:mc="http://schemas.openxmlformats.org/markup-compatibility/2006" xmlns:w="http://schemas.openxmlformats.org/wordprocessingml/2006/main" xmlns:w14="http://schemas.microsoft.com/office/word/2010/wordml" mc:Ignorable="w14 w15 w16se w16cid w16 w16cex w16sdtdh w16sdtfl w16du wp14">
+<w:endnotes xmlns:mc="http://schemas.openxmlformats.org/markup-compatibility/2006" xmlns:w="http://schemas.openxmlformats.org/wordprocessingml/2006/main" xmlns:w14="http://schemas.microsoft.com/office/word/2010/wordml" xmlns:w15="http://schemas.microsoft.com/office/word/2012/wordml" xmlns:w16se="http://schemas.microsoft.com/office/word/2015/wordml/symex" xmlns:w16cid="http://schemas.microsoft.com/office/word/2016/wordml/cid" xmlns:w16="http://schemas.microsoft.com/office/word/2018/wordml" xmlns:w16cex="http://schemas.microsoft.com/office/word/2018/wordml/cex" xmlns:w16sdtdh="http://schemas.microsoft.com/office/word/2020/wordml/sdtdatahash" xmlns:w16sdtfl="http://schemas.microsoft.com/office/word/2024/wordml/sdtformatlock" xmlns:w16du="http://schemas.microsoft.com/office/word/2023/wordml/word16du" xmlns:wp14="http://schemas.microsoft.com/office/word/2010/wordprocessingDrawing" mc:Ignorable="w14 w15 w16se w16cid w16 w16cex w16sdtdh w16sdtfl w16du wp14">
   <w:endnote w:type="separator" w:id="-1">
     <w:p>
       <w:r>
@@ -1347,7 +1347,7 @@
 </file>
 
 <file path=word/footer1.xml><?xml version="1.0" encoding="utf-8"?>
-<w:ftr xmlns:mc="http://schemas.openxmlformats.org/markup-compatibility/2006" xmlns:w="http://schemas.openxmlformats.org/wordprocessingml/2006/main" xmlns:w14="http://schemas.microsoft.com/office/word/2010/wordml" mc:Ignorable="w14 w15 w16se w16cid w16 w16cex w16sdtdh w16sdtfl w16du wp14">
+<w:ftr xmlns:mc="http://schemas.openxmlformats.org/markup-compatibility/2006" xmlns:w="http://schemas.openxmlformats.org/wordprocessingml/2006/main" xmlns:w14="http://schemas.microsoft.com/office/word/2010/wordml" xmlns:w15="http://schemas.microsoft.com/office/word/2012/wordml" xmlns:w16se="http://schemas.microsoft.com/office/word/2015/wordml/symex" xmlns:w16cid="http://schemas.microsoft.com/office/word/2016/wordml/cid" xmlns:w16="http://schemas.microsoft.com/office/word/2018/wordml" xmlns:w16cex="http://schemas.microsoft.com/office/word/2018/wordml/cex" xmlns:w16sdtdh="http://schemas.microsoft.com/office/word/2020/wordml/sdtdatahash" xmlns:w16sdtfl="http://schemas.microsoft.com/office/word/2024/wordml/sdtformatlock" xmlns:w16du="http://schemas.microsoft.com/office/word/2023/wordml/word16du" xmlns:wp14="http://schemas.microsoft.com/office/word/2010/wordprocessingDrawing" mc:Ignorable="w14 w15 w16se w16cid w16 w16cex w16sdtdh w16sdtfl w16du wp14">
   <w:sdt>
     <w:sdtPr>
       <w:id w:val="1954676888"/>
@@ -1393,7 +1393,7 @@
 </file>
 
 <file path=word/footnotes.xml><?xml version="1.0" encoding="utf-8"?>
-<w:footnotes xmlns:mc="http://schemas.openxmlformats.org/markup-compatibility/2006" xmlns:w="http://schemas.openxmlformats.org/wordprocessingml/2006/main" xmlns:w14="http://schemas.microsoft.com/office/word/2010/wordml" mc:Ignorable="w14 w15 w16se w16cid w16 w16cex w16sdtdh w16sdtfl w16du wp14">
+<w:footnotes xmlns:mc="http://schemas.openxmlformats.org/markup-compatibility/2006" xmlns:w="http://schemas.openxmlformats.org/wordprocessingml/2006/main" xmlns:w14="http://schemas.microsoft.com/office/word/2010/wordml" xmlns:w15="http://schemas.microsoft.com/office/word/2012/wordml" xmlns:w16se="http://schemas.microsoft.com/office/word/2015/wordml/symex" xmlns:w16cid="http://schemas.microsoft.com/office/word/2016/wordml/cid" xmlns:w16="http://schemas.microsoft.com/office/word/2018/wordml" xmlns:w16cex="http://schemas.microsoft.com/office/word/2018/wordml/cex" xmlns:w16sdtdh="http://schemas.microsoft.com/office/word/2020/wordml/sdtdatahash" xmlns:w16sdtfl="http://schemas.microsoft.com/office/word/2024/wordml/sdtformatlock" xmlns:w16du="http://schemas.microsoft.com/office/word/2023/wordml/word16du" xmlns:wp14="http://schemas.microsoft.com/office/word/2010/wordprocessingDrawing" mc:Ignorable="w14 w15 w16se w16cid w16 w16cex w16sdtdh w16sdtfl w16du wp14">
   <w:footnote w:type="separator" w:id="-1">
     <w:p>
       <w:r>
@@ -1412,7 +1412,7 @@
 </file>
 
 <file path=word/header1.xml><?xml version="1.0" encoding="utf-8"?>
-<w:hdr xmlns:mc="http://schemas.openxmlformats.org/markup-compatibility/2006" xmlns:w="http://schemas.openxmlformats.org/wordprocessingml/2006/main" xmlns:w14="http://schemas.microsoft.com/office/word/2010/wordml" mc:Ignorable="w14 w15 w16se w16cid w16 w16cex w16sdtdh w16sdtfl w16du wp14">
+<w:hdr xmlns:mc="http://schemas.openxmlformats.org/markup-compatibility/2006" xmlns:w="http://schemas.openxmlformats.org/wordprocessingml/2006/main" xmlns:w14="http://schemas.microsoft.com/office/word/2010/wordml" xmlns:w15="http://schemas.microsoft.com/office/word/2012/wordml" xmlns:w16se="http://schemas.microsoft.com/office/word/2015/wordml/symex" xmlns:w16cid="http://schemas.microsoft.com/office/word/2016/wordml/cid" xmlns:w16="http://schemas.microsoft.com/office/word/2018/wordml" xmlns:w16cex="http://schemas.microsoft.com/office/word/2018/wordml/cex" xmlns:w16sdtdh="http://schemas.microsoft.com/office/word/2020/wordml/sdtdatahash" xmlns:w16sdtfl="http://schemas.microsoft.com/office/word/2024/wordml/sdtformatlock" xmlns:w16du="http://schemas.microsoft.com/office/word/2023/wordml/word16du" xmlns:wp14="http://schemas.microsoft.com/office/word/2010/wordprocessingDrawing" mc:Ignorable="w14 w15 w16se w16cid w16 w16cex w16sdtdh w16sdtfl w16du wp14">
   <w:tbl>
     <w:tblPr>
       <w:tblStyle w:val="a3"/>
@@ -1492,7 +1492,7 @@
 </file>
 
 <file path=word/numbering.xml><?xml version="1.0" encoding="utf-8"?>
-<w:numbering xmlns:mc="http://schemas.openxmlformats.org/markup-compatibility/2006" xmlns:w="http://schemas.openxmlformats.org/wordprocessingml/2006/main" xmlns:w15="http://schemas.microsoft.com/office/word/2012/wordml" xmlns:w16cid="http://schemas.microsoft.com/office/word/2016/wordml/cid" mc:Ignorable="w14 w15 w16se w16cid w16 w16cex w16sdtdh w16sdtfl w16du wp14">
+<w:numbering xmlns:mc="http://schemas.openxmlformats.org/markup-compatibility/2006" xmlns:w="http://schemas.openxmlformats.org/wordprocessingml/2006/main" xmlns:w15="http://schemas.microsoft.com/office/word/2012/wordml" xmlns:w16cid="http://schemas.microsoft.com/office/word/2016/wordml/cid" xmlns:w14="http://schemas.microsoft.com/office/word/2010/wordml" xmlns:w16se="http://schemas.microsoft.com/office/word/2015/wordml/symex" xmlns:w16="http://schemas.microsoft.com/office/word/2018/wordml" xmlns:w16cex="http://schemas.microsoft.com/office/word/2018/wordml/cex" xmlns:w16sdtdh="http://schemas.microsoft.com/office/word/2020/wordml/sdtdatahash" xmlns:w16sdtfl="http://schemas.microsoft.com/office/word/2024/wordml/sdtformatlock" xmlns:w16du="http://schemas.microsoft.com/office/word/2023/wordml/word16du" xmlns:wp14="http://schemas.microsoft.com/office/word/2010/wordprocessingDrawing" mc:Ignorable="w14 w15 w16se w16cid w16 w16cex w16sdtdh w16sdtfl w16du wp14">
   <w:abstractNum w:abstractNumId="0" w15:restartNumberingAfterBreak="0">
     <w:nsid w:val="01EE3AAF"/>
     <w:multiLevelType w:val="hybridMultilevel"/>
@@ -1773,7 +1773,7 @@
 </file>
 
 <file path=word/people.xml><?xml version="1.0" encoding="utf-8"?>
-<w15:people xmlns:mc="http://schemas.openxmlformats.org/markup-compatibility/2006" xmlns:w15="http://schemas.microsoft.com/office/word/2012/wordml" mc:Ignorable="w14 w15 w16se w16cid w16 w16cex w16sdtdh w16sdtfl w16du wp14">
+<w15:people xmlns:mc="http://schemas.openxmlformats.org/markup-compatibility/2006" xmlns:w15="http://schemas.microsoft.com/office/word/2012/wordml" xmlns:w14="http://schemas.microsoft.com/office/word/2010/wordml" xmlns:w16se="http://schemas.microsoft.com/office/word/2015/wordml/symex" xmlns:w16cid="http://schemas.microsoft.com/office/word/2016/wordml/cid" xmlns:w16="http://schemas.microsoft.com/office/word/2018/wordml" xmlns:w16cex="http://schemas.microsoft.com/office/word/2018/wordml/cex" xmlns:w16sdtdh="http://schemas.microsoft.com/office/word/2020/wordml/sdtdatahash" xmlns:w16sdtfl="http://schemas.microsoft.com/office/word/2024/wordml/sdtformatlock" xmlns:w16du="http://schemas.microsoft.com/office/word/2023/wordml/word16du" xmlns:wp14="http://schemas.microsoft.com/office/word/2010/wordprocessingDrawing" mc:Ignorable="w14 w15 w16se w16cid w16 w16cex w16sdtdh w16sdtfl w16du wp14">
   <w15:person w15:author="s s">
     <w15:presenceInfo w15:providerId="Windows Live" w15:userId="6bd97d7f750e84bb"/>
   </w15:person>
@@ -1781,7 +1781,7 @@
 </file>
 
 <file path=word/styles.xml><?xml version="1.0" encoding="utf-8"?>
-<w:styles xmlns:mc="http://schemas.openxmlformats.org/markup-compatibility/2006" xmlns:w="http://schemas.openxmlformats.org/wordprocessingml/2006/main" mc:Ignorable="w14 w15 w16se w16cid w16 w16cex w16sdtdh w16sdtfl w16du">
+<w:styles xmlns:mc="http://schemas.openxmlformats.org/markup-compatibility/2006" xmlns:w="http://schemas.openxmlformats.org/wordprocessingml/2006/main" xmlns:w14="http://schemas.microsoft.com/office/word/2010/wordml" xmlns:w15="http://schemas.microsoft.com/office/word/2012/wordml" xmlns:w16se="http://schemas.microsoft.com/office/word/2015/wordml/symex" xmlns:w16cid="http://schemas.microsoft.com/office/word/2016/wordml/cid" xmlns:w16="http://schemas.microsoft.com/office/word/2018/wordml" xmlns:w16cex="http://schemas.microsoft.com/office/word/2018/wordml/cex" xmlns:w16sdtdh="http://schemas.microsoft.com/office/word/2020/wordml/sdtdatahash" xmlns:w16sdtfl="http://schemas.microsoft.com/office/word/2024/wordml/sdtformatlock" xmlns:w16du="http://schemas.microsoft.com/office/word/2023/wordml/word16du" mc:Ignorable="w14 w15 w16se w16cid w16 w16cex w16sdtdh w16sdtfl w16du">
   <w:docDefaults>
     <w:rPrDefault>
       <w:rPr>

</xml_diff>

<commit_message>
Update advanced course application DOCX files
</commit_message>
<xml_diff>
--- a/downloads/2026_V-LEAD_hatten_hennyu-chousahyo.docx
+++ b/downloads/2026_V-LEAD_hatten_hennyu-chousahyo.docx
@@ -1,6 +1,6 @@
 
 <file path=word/document.xml><?xml version="1.0" encoding="utf-8"?>
-<w:document xmlns:mc="http://schemas.openxmlformats.org/markup-compatibility/2006" xmlns:r="http://schemas.openxmlformats.org/officeDocument/2006/relationships" xmlns:w="http://schemas.openxmlformats.org/wordprocessingml/2006/main" xmlns:w14="http://schemas.microsoft.com/office/word/2010/wordml" xmlns:w15="http://schemas.microsoft.com/office/word/2012/wordml" xmlns:w16se="http://schemas.microsoft.com/office/word/2015/wordml/symex" xmlns:w16cid="http://schemas.microsoft.com/office/word/2016/wordml/cid" xmlns:w16="http://schemas.microsoft.com/office/word/2018/wordml" xmlns:w16cex="http://schemas.microsoft.com/office/word/2018/wordml/cex" xmlns:w16sdtdh="http://schemas.microsoft.com/office/word/2020/wordml/sdtdatahash" xmlns:w16sdtfl="http://schemas.microsoft.com/office/word/2024/wordml/sdtformatlock" xmlns:w16du="http://schemas.microsoft.com/office/word/2023/wordml/word16du" xmlns:wp14="http://schemas.microsoft.com/office/word/2010/wordprocessingDrawing" mc:Ignorable="w14 w15 w16se w16cid w16 w16cex w16sdtdh w16sdtfl w16du wp14">
+<w:document xmlns:wpc="http://schemas.microsoft.com/office/word/2010/wordprocessingCanvas" xmlns:cx="http://schemas.microsoft.com/office/drawing/2014/chartex" xmlns:cx1="http://schemas.microsoft.com/office/drawing/2015/9/8/chartex" xmlns:cx2="http://schemas.microsoft.com/office/drawing/2015/10/21/chartex" xmlns:cx3="http://schemas.microsoft.com/office/drawing/2016/5/9/chartex" xmlns:cx4="http://schemas.microsoft.com/office/drawing/2016/5/10/chartex" xmlns:cx5="http://schemas.microsoft.com/office/drawing/2016/5/11/chartex" xmlns:cx6="http://schemas.microsoft.com/office/drawing/2016/5/12/chartex" xmlns:cx7="http://schemas.microsoft.com/office/drawing/2016/5/13/chartex" xmlns:cx8="http://schemas.microsoft.com/office/drawing/2016/5/14/chartex" xmlns:mc="http://schemas.openxmlformats.org/markup-compatibility/2006" xmlns:aink="http://schemas.microsoft.com/office/drawing/2016/ink" xmlns:am3d="http://schemas.microsoft.com/office/drawing/2017/model3d" xmlns:o="urn:schemas-microsoft-com:office:office" xmlns:oel="http://schemas.microsoft.com/office/2019/extlst" xmlns:r="http://schemas.openxmlformats.org/officeDocument/2006/relationships" xmlns:m="http://schemas.openxmlformats.org/officeDocument/2006/math" xmlns:v="urn:schemas-microsoft-com:vml" xmlns:wp14="http://schemas.microsoft.com/office/word/2010/wordprocessingDrawing" xmlns:wp="http://schemas.openxmlformats.org/drawingml/2006/wordprocessingDrawing" xmlns:w10="urn:schemas-microsoft-com:office:word" xmlns:w="http://schemas.openxmlformats.org/wordprocessingml/2006/main" xmlns:w14="http://schemas.microsoft.com/office/word/2010/wordml" xmlns:w15="http://schemas.microsoft.com/office/word/2012/wordml" xmlns:w16cex="http://schemas.microsoft.com/office/word/2018/wordml/cex" xmlns:w16cid="http://schemas.microsoft.com/office/word/2016/wordml/cid" xmlns:w16="http://schemas.microsoft.com/office/word/2018/wordml" xmlns:w16du="http://schemas.microsoft.com/office/word/2023/wordml/word16du" xmlns:w16sdtdh="http://schemas.microsoft.com/office/word/2020/wordml/sdtdatahash" xmlns:w16sdtfl="http://schemas.microsoft.com/office/word/2024/wordml/sdtformatlock" xmlns:w16se="http://schemas.microsoft.com/office/word/2015/wordml/symex" xmlns:wpg="http://schemas.microsoft.com/office/word/2010/wordprocessingGroup" xmlns:wpi="http://schemas.microsoft.com/office/word/2010/wordprocessingInk" xmlns:wne="http://schemas.microsoft.com/office/word/2006/wordml" xmlns:wps="http://schemas.microsoft.com/office/word/2010/wordprocessingShape" mc:Ignorable="w14 w15 w16se w16cid w16 w16cex w16sdtdh w16sdtfl w16du wp14">
   <w:body>
     <w:p>
       <w:pPr>
@@ -29,7 +29,7 @@
           <w:szCs w:val="28"/>
         </w:rPr>
       </w:pPr>
-      <w:bookmarkStart w:id="1" w:name="_Hlk495997791"/>
+      <w:bookmarkStart w:id="0" w:name="_Hlk495997791"/>
       <w:r>
         <w:rPr>
           <w:rFonts w:ascii="Century" w:eastAsia="ＭＳ 明朝" w:hAnsi="Century" w:hint="eastAsia"/>
@@ -66,17 +66,7 @@
         <w:t>（発展コース編入）</w:t>
       </w:r>
     </w:p>
-    <w:bookmarkEnd w:id="1"/>
-    <w:p>
-      <w:pPr>
-        <w:spacing w:line="324" w:lineRule="auto"/>
-        <w:jc w:val="center"/>
-        <w:rPr>
-          <w:rFonts w:ascii="Century" w:eastAsia="ＭＳ 明朝" w:hAnsi="Century"/>
-          <w:sz w:val="22"/>
-        </w:rPr>
-      </w:pPr>
-    </w:p>
+    <w:bookmarkEnd w:id="0"/>
     <w:p>
       <w:pPr>
         <w:spacing w:line="480" w:lineRule="auto"/>
@@ -641,15 +631,6 @@
     </w:tbl>
     <w:p>
       <w:pPr>
-        <w:spacing w:line="480" w:lineRule="auto"/>
-        <w:rPr>
-          <w:rFonts w:ascii="Century" w:eastAsia="ＭＳ 明朝" w:hAnsi="Century"/>
-          <w:sz w:val="22"/>
-        </w:rPr>
-      </w:pPr>
-    </w:p>
-    <w:p>
-      <w:pPr>
         <w:snapToGrid w:val="0"/>
         <w:spacing w:line="324" w:lineRule="auto"/>
         <w:rPr>
@@ -826,6 +807,7 @@
     <w:p>
       <w:pPr>
         <w:spacing w:line="324" w:lineRule="auto"/>
+        <w:ind w:left="220" w:hangingChars="100" w:hanging="220"/>
         <w:rPr>
           <w:rFonts w:ascii="Century" w:eastAsia="ＭＳ 明朝" w:hAnsi="Century"/>
           <w:sz w:val="22"/>
@@ -870,7 +852,6 @@
     <w:p>
       <w:pPr>
         <w:spacing w:line="324" w:lineRule="auto"/>
-        <w:ind w:left="220" w:hangingChars="100" w:hanging="220"/>
         <w:rPr>
           <w:rFonts w:ascii="Century" w:eastAsia="ＭＳ 明朝" w:hAnsi="Century"/>
           <w:sz w:val="22"/>
@@ -879,12 +860,83 @@
     </w:p>
     <w:p>
       <w:pPr>
+        <w:snapToGrid w:val="0"/>
         <w:spacing w:line="324" w:lineRule="auto"/>
         <w:rPr>
           <w:rFonts w:ascii="Century" w:eastAsia="ＭＳ 明朝" w:hAnsi="Century"/>
           <w:sz w:val="22"/>
         </w:rPr>
       </w:pPr>
+      <w:r>
+        <w:rPr>
+          <w:rFonts w:ascii="Century" w:eastAsia="ＭＳ 明朝" w:hAnsi="Century" w:hint="eastAsia"/>
+          <w:sz w:val="22"/>
+        </w:rPr>
+        <w:t>2</w:t>
+      </w:r>
+      <w:r>
+        <w:rPr>
+          <w:rFonts w:ascii="Century" w:eastAsia="ＭＳ 明朝" w:hAnsi="Century" w:hint="eastAsia"/>
+          <w:sz w:val="22"/>
+        </w:rPr>
+        <w:t>～</w:t>
+      </w:r>
+      <w:r>
+        <w:rPr>
+          <w:rFonts w:ascii="Century" w:eastAsia="ＭＳ 明朝" w:hAnsi="Century"/>
+          <w:sz w:val="22"/>
+        </w:rPr>
+        <w:t>3</w:t>
+      </w:r>
+      <w:r>
+        <w:rPr>
+          <w:rFonts w:ascii="Century" w:eastAsia="ＭＳ 明朝" w:hAnsi="Century" w:hint="eastAsia"/>
+          <w:sz w:val="22"/>
+        </w:rPr>
+        <w:t>ページにある</w:t>
+      </w:r>
+      <w:r>
+        <w:rPr>
+          <w:rFonts w:ascii="Century" w:eastAsia="ＭＳ 明朝" w:hAnsi="Century" w:hint="eastAsia"/>
+          <w:sz w:val="22"/>
+        </w:rPr>
+        <w:t>1</w:t>
+      </w:r>
+      <w:r>
+        <w:rPr>
+          <w:rFonts w:ascii="Century" w:eastAsia="ＭＳ 明朝" w:hAnsi="Century" w:hint="eastAsia"/>
+          <w:sz w:val="22"/>
+        </w:rPr>
+        <w:t>－</w:t>
+      </w:r>
+      <w:r>
+        <w:rPr>
+          <w:rFonts w:ascii="Century" w:eastAsia="ＭＳ 明朝" w:hAnsi="Century" w:hint="eastAsia"/>
+          <w:sz w:val="22"/>
+        </w:rPr>
+        <w:t>3</w:t>
+      </w:r>
+      <w:r>
+        <w:rPr>
+          <w:rFonts w:ascii="Century" w:eastAsia="ＭＳ 明朝" w:hAnsi="Century" w:hint="eastAsia"/>
+          <w:sz w:val="22"/>
+        </w:rPr>
+        <w:t>の質問に回答してくださ</w:t>
+      </w:r>
+      <w:r>
+        <w:rPr>
+          <w:rFonts w:ascii="Century" w:eastAsia="ＭＳ 明朝" w:hAnsi="Century" w:hint="eastAsia"/>
+          <w:sz w:val="22"/>
+        </w:rPr>
+        <w:t>い</w:t>
+      </w:r>
+      <w:r>
+        <w:rPr>
+          <w:rFonts w:ascii="Century" w:eastAsia="ＭＳ 明朝" w:hAnsi="Century" w:hint="eastAsia"/>
+          <w:sz w:val="22"/>
+        </w:rPr>
+        <w:t>。受講生選抜の際の審査資料となりますので、本プログラムの趣旨をよく理解し、記述してください。</w:t>
+      </w:r>
     </w:p>
     <w:p>
       <w:pPr>
@@ -895,161 +947,41 @@
           <w:sz w:val="22"/>
         </w:rPr>
       </w:pPr>
-    </w:p>
-    <w:p>
-      <w:pPr>
-        <w:snapToGrid w:val="0"/>
-        <w:spacing w:line="324" w:lineRule="auto"/>
-        <w:rPr>
-          <w:rFonts w:ascii="Century" w:eastAsia="ＭＳ 明朝" w:hAnsi="Century"/>
-          <w:sz w:val="22"/>
-        </w:rPr>
-      </w:pPr>
       <w:r>
         <w:rPr>
           <w:rFonts w:ascii="Century" w:eastAsia="ＭＳ 明朝" w:hAnsi="Century" w:hint="eastAsia"/>
           <w:sz w:val="22"/>
         </w:rPr>
-        <w:t>2</w:t>
+        <w:t>また、</w:t>
       </w:r>
       <w:r>
         <w:rPr>
           <w:rFonts w:ascii="Century" w:eastAsia="ＭＳ 明朝" w:hAnsi="Century" w:hint="eastAsia"/>
           <w:sz w:val="22"/>
         </w:rPr>
-        <w:t>～</w:t>
-      </w:r>
-      <w:r>
-        <w:rPr>
-          <w:rFonts w:ascii="Century" w:eastAsia="ＭＳ 明朝" w:hAnsi="Century"/>
-          <w:sz w:val="22"/>
-        </w:rPr>
-        <w:t>3</w:t>
+        <w:t>フォントは</w:t>
       </w:r>
       <w:r>
         <w:rPr>
           <w:rFonts w:ascii="Century" w:eastAsia="ＭＳ 明朝" w:hAnsi="Century" w:hint="eastAsia"/>
           <w:sz w:val="22"/>
         </w:rPr>
-        <w:t>ページにある</w:t>
+        <w:t>11pt</w:t>
       </w:r>
       <w:r>
         <w:rPr>
           <w:rFonts w:ascii="Century" w:eastAsia="ＭＳ 明朝" w:hAnsi="Century" w:hint="eastAsia"/>
           <w:sz w:val="22"/>
         </w:rPr>
-        <w:t>1</w:t>
+        <w:t>以上で、</w:t>
       </w:r>
       <w:r>
         <w:rPr>
           <w:rFonts w:ascii="Century" w:eastAsia="ＭＳ 明朝" w:hAnsi="Century" w:hint="eastAsia"/>
           <w:sz w:val="22"/>
         </w:rPr>
-        <w:t>－</w:t>
-      </w:r>
-      <w:r>
-        <w:rPr>
-          <w:rFonts w:ascii="Century" w:eastAsia="ＭＳ 明朝" w:hAnsi="Century" w:hint="eastAsia"/>
-          <w:sz w:val="22"/>
-        </w:rPr>
-        <w:t>3</w:t>
-      </w:r>
-      <w:r>
-        <w:rPr>
-          <w:rFonts w:ascii="Century" w:eastAsia="ＭＳ 明朝" w:hAnsi="Century" w:hint="eastAsia"/>
-          <w:sz w:val="22"/>
-        </w:rPr>
-        <w:t>の質問に回答してくださ</w:t>
-      </w:r>
-      <w:r>
-        <w:rPr>
-          <w:rFonts w:ascii="Century" w:eastAsia="ＭＳ 明朝" w:hAnsi="Century" w:hint="eastAsia"/>
-          <w:sz w:val="22"/>
-        </w:rPr>
-        <w:t>い</w:t>
-      </w:r>
-      <w:r>
-        <w:rPr>
-          <w:rFonts w:ascii="Century" w:eastAsia="ＭＳ 明朝" w:hAnsi="Century" w:hint="eastAsia"/>
-          <w:sz w:val="22"/>
-        </w:rPr>
-        <w:t>。受講生選抜の際の審査資料となりますので、本プログラムの趣旨をよく理解し、記述してください。</w:t>
-      </w:r>
-    </w:p>
-    <w:p>
-      <w:pPr>
-        <w:snapToGrid w:val="0"/>
-        <w:spacing w:line="324" w:lineRule="auto"/>
-        <w:rPr>
-          <w:rFonts w:ascii="Century" w:eastAsia="ＭＳ 明朝" w:hAnsi="Century"/>
-          <w:sz w:val="22"/>
-        </w:rPr>
-      </w:pPr>
-      <w:r>
-        <w:rPr>
-          <w:rFonts w:ascii="Century" w:eastAsia="ＭＳ 明朝" w:hAnsi="Century" w:hint="eastAsia"/>
-          <w:sz w:val="22"/>
-        </w:rPr>
-        <w:t>また、</w:t>
-      </w:r>
-      <w:r>
-        <w:rPr>
-          <w:rFonts w:ascii="Century" w:eastAsia="ＭＳ 明朝" w:hAnsi="Century" w:hint="eastAsia"/>
-          <w:sz w:val="22"/>
-        </w:rPr>
-        <w:t>フォントは</w:t>
-      </w:r>
-      <w:r>
-        <w:rPr>
-          <w:rFonts w:ascii="Century" w:eastAsia="ＭＳ 明朝" w:hAnsi="Century" w:hint="eastAsia"/>
-          <w:sz w:val="22"/>
-        </w:rPr>
-        <w:t>11pt</w:t>
-      </w:r>
-      <w:r>
-        <w:rPr>
-          <w:rFonts w:ascii="Century" w:eastAsia="ＭＳ 明朝" w:hAnsi="Century" w:hint="eastAsia"/>
-          <w:sz w:val="22"/>
-        </w:rPr>
-        <w:t>以上で、</w:t>
-      </w:r>
-      <w:r>
-        <w:rPr>
-          <w:rFonts w:ascii="Century" w:eastAsia="ＭＳ 明朝" w:hAnsi="Century" w:hint="eastAsia"/>
-          <w:sz w:val="22"/>
-        </w:rPr>
         <w:t>指定された範囲に収まる分量で記載してください。</w:t>
       </w:r>
-    </w:p>
-    <w:p>
-      <w:pPr>
-        <w:snapToGrid w:val="0"/>
-        <w:spacing w:line="324" w:lineRule="auto"/>
-        <w:rPr>
-          <w:rFonts w:ascii="Century" w:eastAsia="ＭＳ 明朝" w:hAnsi="Century"/>
-          <w:sz w:val="22"/>
-        </w:rPr>
-      </w:pPr>
-    </w:p>
-    <w:p>
-      <w:pPr>
-        <w:snapToGrid w:val="0"/>
-        <w:spacing w:line="324" w:lineRule="auto"/>
-        <w:rPr>
-          <w:rFonts w:ascii="Century" w:eastAsia="ＭＳ 明朝" w:hAnsi="Century"/>
-          <w:sz w:val="22"/>
-        </w:rPr>
-      </w:pPr>
-    </w:p>
-    <w:p>
-      <w:pPr>
-        <w:snapToGrid w:val="0"/>
-        <w:spacing w:line="324" w:lineRule="auto"/>
-        <w:rPr>
-          <w:rFonts w:ascii="Century" w:eastAsia="ＭＳ 明朝" w:hAnsi="Century"/>
-          <w:sz w:val="22"/>
-        </w:rPr>
-      </w:pPr>
     </w:p>
     <w:p>
       <w:pPr>
@@ -1328,7 +1260,7 @@
 </file>
 
 <file path=word/endnotes.xml><?xml version="1.0" encoding="utf-8"?>
-<w:endnotes xmlns:mc="http://schemas.openxmlformats.org/markup-compatibility/2006" xmlns:w="http://schemas.openxmlformats.org/wordprocessingml/2006/main" xmlns:w14="http://schemas.microsoft.com/office/word/2010/wordml" xmlns:w15="http://schemas.microsoft.com/office/word/2012/wordml" xmlns:w16se="http://schemas.microsoft.com/office/word/2015/wordml/symex" xmlns:w16cid="http://schemas.microsoft.com/office/word/2016/wordml/cid" xmlns:w16="http://schemas.microsoft.com/office/word/2018/wordml" xmlns:w16cex="http://schemas.microsoft.com/office/word/2018/wordml/cex" xmlns:w16sdtdh="http://schemas.microsoft.com/office/word/2020/wordml/sdtdatahash" xmlns:w16sdtfl="http://schemas.microsoft.com/office/word/2024/wordml/sdtformatlock" xmlns:w16du="http://schemas.microsoft.com/office/word/2023/wordml/word16du" xmlns:wp14="http://schemas.microsoft.com/office/word/2010/wordprocessingDrawing" mc:Ignorable="w14 w15 w16se w16cid w16 w16cex w16sdtdh w16sdtfl w16du wp14">
+<w:endnotes xmlns:wpc="http://schemas.microsoft.com/office/word/2010/wordprocessingCanvas" xmlns:cx="http://schemas.microsoft.com/office/drawing/2014/chartex" xmlns:cx1="http://schemas.microsoft.com/office/drawing/2015/9/8/chartex" xmlns:cx2="http://schemas.microsoft.com/office/drawing/2015/10/21/chartex" xmlns:cx3="http://schemas.microsoft.com/office/drawing/2016/5/9/chartex" xmlns:cx4="http://schemas.microsoft.com/office/drawing/2016/5/10/chartex" xmlns:cx5="http://schemas.microsoft.com/office/drawing/2016/5/11/chartex" xmlns:cx6="http://schemas.microsoft.com/office/drawing/2016/5/12/chartex" xmlns:cx7="http://schemas.microsoft.com/office/drawing/2016/5/13/chartex" xmlns:cx8="http://schemas.microsoft.com/office/drawing/2016/5/14/chartex" xmlns:mc="http://schemas.openxmlformats.org/markup-compatibility/2006" xmlns:aink="http://schemas.microsoft.com/office/drawing/2016/ink" xmlns:am3d="http://schemas.microsoft.com/office/drawing/2017/model3d" xmlns:o="urn:schemas-microsoft-com:office:office" xmlns:oel="http://schemas.microsoft.com/office/2019/extlst" xmlns:r="http://schemas.openxmlformats.org/officeDocument/2006/relationships" xmlns:m="http://schemas.openxmlformats.org/officeDocument/2006/math" xmlns:v="urn:schemas-microsoft-com:vml" xmlns:wp14="http://schemas.microsoft.com/office/word/2010/wordprocessingDrawing" xmlns:wp="http://schemas.openxmlformats.org/drawingml/2006/wordprocessingDrawing" xmlns:w10="urn:schemas-microsoft-com:office:word" xmlns:w="http://schemas.openxmlformats.org/wordprocessingml/2006/main" xmlns:w14="http://schemas.microsoft.com/office/word/2010/wordml" xmlns:w15="http://schemas.microsoft.com/office/word/2012/wordml" xmlns:w16cex="http://schemas.microsoft.com/office/word/2018/wordml/cex" xmlns:w16cid="http://schemas.microsoft.com/office/word/2016/wordml/cid" xmlns:w16="http://schemas.microsoft.com/office/word/2018/wordml" xmlns:w16du="http://schemas.microsoft.com/office/word/2023/wordml/word16du" xmlns:w16sdtdh="http://schemas.microsoft.com/office/word/2020/wordml/sdtdatahash" xmlns:w16sdtfl="http://schemas.microsoft.com/office/word/2024/wordml/sdtformatlock" xmlns:w16se="http://schemas.microsoft.com/office/word/2015/wordml/symex" xmlns:wpg="http://schemas.microsoft.com/office/word/2010/wordprocessingGroup" xmlns:wpi="http://schemas.microsoft.com/office/word/2010/wordprocessingInk" xmlns:wne="http://schemas.microsoft.com/office/word/2006/wordml" xmlns:wps="http://schemas.microsoft.com/office/word/2010/wordprocessingShape" mc:Ignorable="w14 w15 w16se w16cid w16 w16cex w16sdtdh w16sdtfl w16du wp14">
   <w:endnote w:type="separator" w:id="-1">
     <w:p>
       <w:r>
@@ -1347,7 +1279,7 @@
 </file>
 
 <file path=word/footer1.xml><?xml version="1.0" encoding="utf-8"?>
-<w:ftr xmlns:mc="http://schemas.openxmlformats.org/markup-compatibility/2006" xmlns:w="http://schemas.openxmlformats.org/wordprocessingml/2006/main" xmlns:w14="http://schemas.microsoft.com/office/word/2010/wordml" xmlns:w15="http://schemas.microsoft.com/office/word/2012/wordml" xmlns:w16se="http://schemas.microsoft.com/office/word/2015/wordml/symex" xmlns:w16cid="http://schemas.microsoft.com/office/word/2016/wordml/cid" xmlns:w16="http://schemas.microsoft.com/office/word/2018/wordml" xmlns:w16cex="http://schemas.microsoft.com/office/word/2018/wordml/cex" xmlns:w16sdtdh="http://schemas.microsoft.com/office/word/2020/wordml/sdtdatahash" xmlns:w16sdtfl="http://schemas.microsoft.com/office/word/2024/wordml/sdtformatlock" xmlns:w16du="http://schemas.microsoft.com/office/word/2023/wordml/word16du" xmlns:wp14="http://schemas.microsoft.com/office/word/2010/wordprocessingDrawing" mc:Ignorable="w14 w15 w16se w16cid w16 w16cex w16sdtdh w16sdtfl w16du wp14">
+<w:ftr xmlns:wpc="http://schemas.microsoft.com/office/word/2010/wordprocessingCanvas" xmlns:cx="http://schemas.microsoft.com/office/drawing/2014/chartex" xmlns:cx1="http://schemas.microsoft.com/office/drawing/2015/9/8/chartex" xmlns:cx2="http://schemas.microsoft.com/office/drawing/2015/10/21/chartex" xmlns:cx3="http://schemas.microsoft.com/office/drawing/2016/5/9/chartex" xmlns:cx4="http://schemas.microsoft.com/office/drawing/2016/5/10/chartex" xmlns:cx5="http://schemas.microsoft.com/office/drawing/2016/5/11/chartex" xmlns:cx6="http://schemas.microsoft.com/office/drawing/2016/5/12/chartex" xmlns:cx7="http://schemas.microsoft.com/office/drawing/2016/5/13/chartex" xmlns:cx8="http://schemas.microsoft.com/office/drawing/2016/5/14/chartex" xmlns:mc="http://schemas.openxmlformats.org/markup-compatibility/2006" xmlns:aink="http://schemas.microsoft.com/office/drawing/2016/ink" xmlns:am3d="http://schemas.microsoft.com/office/drawing/2017/model3d" xmlns:o="urn:schemas-microsoft-com:office:office" xmlns:oel="http://schemas.microsoft.com/office/2019/extlst" xmlns:r="http://schemas.openxmlformats.org/officeDocument/2006/relationships" xmlns:m="http://schemas.openxmlformats.org/officeDocument/2006/math" xmlns:v="urn:schemas-microsoft-com:vml" xmlns:wp14="http://schemas.microsoft.com/office/word/2010/wordprocessingDrawing" xmlns:wp="http://schemas.openxmlformats.org/drawingml/2006/wordprocessingDrawing" xmlns:w10="urn:schemas-microsoft-com:office:word" xmlns:w="http://schemas.openxmlformats.org/wordprocessingml/2006/main" xmlns:w14="http://schemas.microsoft.com/office/word/2010/wordml" xmlns:w15="http://schemas.microsoft.com/office/word/2012/wordml" xmlns:w16cex="http://schemas.microsoft.com/office/word/2018/wordml/cex" xmlns:w16cid="http://schemas.microsoft.com/office/word/2016/wordml/cid" xmlns:w16="http://schemas.microsoft.com/office/word/2018/wordml" xmlns:w16du="http://schemas.microsoft.com/office/word/2023/wordml/word16du" xmlns:w16sdtdh="http://schemas.microsoft.com/office/word/2020/wordml/sdtdatahash" xmlns:w16sdtfl="http://schemas.microsoft.com/office/word/2024/wordml/sdtformatlock" xmlns:w16se="http://schemas.microsoft.com/office/word/2015/wordml/symex" xmlns:wpg="http://schemas.microsoft.com/office/word/2010/wordprocessingGroup" xmlns:wpi="http://schemas.microsoft.com/office/word/2010/wordprocessingInk" xmlns:wne="http://schemas.microsoft.com/office/word/2006/wordml" xmlns:wps="http://schemas.microsoft.com/office/word/2010/wordprocessingShape" mc:Ignorable="w14 w15 w16se w16cid w16 w16cex w16sdtdh w16sdtfl w16du wp14">
   <w:sdt>
     <w:sdtPr>
       <w:id w:val="1954676888"/>
@@ -1393,7 +1325,7 @@
 </file>
 
 <file path=word/footnotes.xml><?xml version="1.0" encoding="utf-8"?>
-<w:footnotes xmlns:mc="http://schemas.openxmlformats.org/markup-compatibility/2006" xmlns:w="http://schemas.openxmlformats.org/wordprocessingml/2006/main" xmlns:w14="http://schemas.microsoft.com/office/word/2010/wordml" xmlns:w15="http://schemas.microsoft.com/office/word/2012/wordml" xmlns:w16se="http://schemas.microsoft.com/office/word/2015/wordml/symex" xmlns:w16cid="http://schemas.microsoft.com/office/word/2016/wordml/cid" xmlns:w16="http://schemas.microsoft.com/office/word/2018/wordml" xmlns:w16cex="http://schemas.microsoft.com/office/word/2018/wordml/cex" xmlns:w16sdtdh="http://schemas.microsoft.com/office/word/2020/wordml/sdtdatahash" xmlns:w16sdtfl="http://schemas.microsoft.com/office/word/2024/wordml/sdtformatlock" xmlns:w16du="http://schemas.microsoft.com/office/word/2023/wordml/word16du" xmlns:wp14="http://schemas.microsoft.com/office/word/2010/wordprocessingDrawing" mc:Ignorable="w14 w15 w16se w16cid w16 w16cex w16sdtdh w16sdtfl w16du wp14">
+<w:footnotes xmlns:wpc="http://schemas.microsoft.com/office/word/2010/wordprocessingCanvas" xmlns:cx="http://schemas.microsoft.com/office/drawing/2014/chartex" xmlns:cx1="http://schemas.microsoft.com/office/drawing/2015/9/8/chartex" xmlns:cx2="http://schemas.microsoft.com/office/drawing/2015/10/21/chartex" xmlns:cx3="http://schemas.microsoft.com/office/drawing/2016/5/9/chartex" xmlns:cx4="http://schemas.microsoft.com/office/drawing/2016/5/10/chartex" xmlns:cx5="http://schemas.microsoft.com/office/drawing/2016/5/11/chartex" xmlns:cx6="http://schemas.microsoft.com/office/drawing/2016/5/12/chartex" xmlns:cx7="http://schemas.microsoft.com/office/drawing/2016/5/13/chartex" xmlns:cx8="http://schemas.microsoft.com/office/drawing/2016/5/14/chartex" xmlns:mc="http://schemas.openxmlformats.org/markup-compatibility/2006" xmlns:aink="http://schemas.microsoft.com/office/drawing/2016/ink" xmlns:am3d="http://schemas.microsoft.com/office/drawing/2017/model3d" xmlns:o="urn:schemas-microsoft-com:office:office" xmlns:oel="http://schemas.microsoft.com/office/2019/extlst" xmlns:r="http://schemas.openxmlformats.org/officeDocument/2006/relationships" xmlns:m="http://schemas.openxmlformats.org/officeDocument/2006/math" xmlns:v="urn:schemas-microsoft-com:vml" xmlns:wp14="http://schemas.microsoft.com/office/word/2010/wordprocessingDrawing" xmlns:wp="http://schemas.openxmlformats.org/drawingml/2006/wordprocessingDrawing" xmlns:w10="urn:schemas-microsoft-com:office:word" xmlns:w="http://schemas.openxmlformats.org/wordprocessingml/2006/main" xmlns:w14="http://schemas.microsoft.com/office/word/2010/wordml" xmlns:w15="http://schemas.microsoft.com/office/word/2012/wordml" xmlns:w16cex="http://schemas.microsoft.com/office/word/2018/wordml/cex" xmlns:w16cid="http://schemas.microsoft.com/office/word/2016/wordml/cid" xmlns:w16="http://schemas.microsoft.com/office/word/2018/wordml" xmlns:w16du="http://schemas.microsoft.com/office/word/2023/wordml/word16du" xmlns:w16sdtdh="http://schemas.microsoft.com/office/word/2020/wordml/sdtdatahash" xmlns:w16sdtfl="http://schemas.microsoft.com/office/word/2024/wordml/sdtformatlock" xmlns:w16se="http://schemas.microsoft.com/office/word/2015/wordml/symex" xmlns:wpg="http://schemas.microsoft.com/office/word/2010/wordprocessingGroup" xmlns:wpi="http://schemas.microsoft.com/office/word/2010/wordprocessingInk" xmlns:wne="http://schemas.microsoft.com/office/word/2006/wordml" xmlns:wps="http://schemas.microsoft.com/office/word/2010/wordprocessingShape" mc:Ignorable="w14 w15 w16se w16cid w16 w16cex w16sdtdh w16sdtfl w16du wp14">
   <w:footnote w:type="separator" w:id="-1">
     <w:p>
       <w:r>
@@ -1412,7 +1344,7 @@
 </file>
 
 <file path=word/header1.xml><?xml version="1.0" encoding="utf-8"?>
-<w:hdr xmlns:mc="http://schemas.openxmlformats.org/markup-compatibility/2006" xmlns:w="http://schemas.openxmlformats.org/wordprocessingml/2006/main" xmlns:w14="http://schemas.microsoft.com/office/word/2010/wordml" xmlns:w15="http://schemas.microsoft.com/office/word/2012/wordml" xmlns:w16se="http://schemas.microsoft.com/office/word/2015/wordml/symex" xmlns:w16cid="http://schemas.microsoft.com/office/word/2016/wordml/cid" xmlns:w16="http://schemas.microsoft.com/office/word/2018/wordml" xmlns:w16cex="http://schemas.microsoft.com/office/word/2018/wordml/cex" xmlns:w16sdtdh="http://schemas.microsoft.com/office/word/2020/wordml/sdtdatahash" xmlns:w16sdtfl="http://schemas.microsoft.com/office/word/2024/wordml/sdtformatlock" xmlns:w16du="http://schemas.microsoft.com/office/word/2023/wordml/word16du" xmlns:wp14="http://schemas.microsoft.com/office/word/2010/wordprocessingDrawing" mc:Ignorable="w14 w15 w16se w16cid w16 w16cex w16sdtdh w16sdtfl w16du wp14">
+<w:hdr xmlns:wpc="http://schemas.microsoft.com/office/word/2010/wordprocessingCanvas" xmlns:cx="http://schemas.microsoft.com/office/drawing/2014/chartex" xmlns:cx1="http://schemas.microsoft.com/office/drawing/2015/9/8/chartex" xmlns:cx2="http://schemas.microsoft.com/office/drawing/2015/10/21/chartex" xmlns:cx3="http://schemas.microsoft.com/office/drawing/2016/5/9/chartex" xmlns:cx4="http://schemas.microsoft.com/office/drawing/2016/5/10/chartex" xmlns:cx5="http://schemas.microsoft.com/office/drawing/2016/5/11/chartex" xmlns:cx6="http://schemas.microsoft.com/office/drawing/2016/5/12/chartex" xmlns:cx7="http://schemas.microsoft.com/office/drawing/2016/5/13/chartex" xmlns:cx8="http://schemas.microsoft.com/office/drawing/2016/5/14/chartex" xmlns:mc="http://schemas.openxmlformats.org/markup-compatibility/2006" xmlns:aink="http://schemas.microsoft.com/office/drawing/2016/ink" xmlns:am3d="http://schemas.microsoft.com/office/drawing/2017/model3d" xmlns:o="urn:schemas-microsoft-com:office:office" xmlns:oel="http://schemas.microsoft.com/office/2019/extlst" xmlns:r="http://schemas.openxmlformats.org/officeDocument/2006/relationships" xmlns:m="http://schemas.openxmlformats.org/officeDocument/2006/math" xmlns:v="urn:schemas-microsoft-com:vml" xmlns:wp14="http://schemas.microsoft.com/office/word/2010/wordprocessingDrawing" xmlns:wp="http://schemas.openxmlformats.org/drawingml/2006/wordprocessingDrawing" xmlns:w10="urn:schemas-microsoft-com:office:word" xmlns:w="http://schemas.openxmlformats.org/wordprocessingml/2006/main" xmlns:w14="http://schemas.microsoft.com/office/word/2010/wordml" xmlns:w15="http://schemas.microsoft.com/office/word/2012/wordml" xmlns:w16cex="http://schemas.microsoft.com/office/word/2018/wordml/cex" xmlns:w16cid="http://schemas.microsoft.com/office/word/2016/wordml/cid" xmlns:w16="http://schemas.microsoft.com/office/word/2018/wordml" xmlns:w16du="http://schemas.microsoft.com/office/word/2023/wordml/word16du" xmlns:w16sdtdh="http://schemas.microsoft.com/office/word/2020/wordml/sdtdatahash" xmlns:w16sdtfl="http://schemas.microsoft.com/office/word/2024/wordml/sdtformatlock" xmlns:w16se="http://schemas.microsoft.com/office/word/2015/wordml/symex" xmlns:wpg="http://schemas.microsoft.com/office/word/2010/wordprocessingGroup" xmlns:wpi="http://schemas.microsoft.com/office/word/2010/wordprocessingInk" xmlns:wne="http://schemas.microsoft.com/office/word/2006/wordml" xmlns:wps="http://schemas.microsoft.com/office/word/2010/wordprocessingShape" mc:Ignorable="w14 w15 w16se w16cid w16 w16cex w16sdtdh w16sdtfl w16du wp14">
   <w:tbl>
     <w:tblPr>
       <w:tblStyle w:val="a3"/>
@@ -1492,7 +1424,7 @@
 </file>
 
 <file path=word/numbering.xml><?xml version="1.0" encoding="utf-8"?>
-<w:numbering xmlns:mc="http://schemas.openxmlformats.org/markup-compatibility/2006" xmlns:w="http://schemas.openxmlformats.org/wordprocessingml/2006/main" xmlns:w15="http://schemas.microsoft.com/office/word/2012/wordml" xmlns:w16cid="http://schemas.microsoft.com/office/word/2016/wordml/cid" xmlns:w14="http://schemas.microsoft.com/office/word/2010/wordml" xmlns:w16se="http://schemas.microsoft.com/office/word/2015/wordml/symex" xmlns:w16="http://schemas.microsoft.com/office/word/2018/wordml" xmlns:w16cex="http://schemas.microsoft.com/office/word/2018/wordml/cex" xmlns:w16sdtdh="http://schemas.microsoft.com/office/word/2020/wordml/sdtdatahash" xmlns:w16sdtfl="http://schemas.microsoft.com/office/word/2024/wordml/sdtformatlock" xmlns:w16du="http://schemas.microsoft.com/office/word/2023/wordml/word16du" xmlns:wp14="http://schemas.microsoft.com/office/word/2010/wordprocessingDrawing" mc:Ignorable="w14 w15 w16se w16cid w16 w16cex w16sdtdh w16sdtfl w16du wp14">
+<w:numbering xmlns:wpc="http://schemas.microsoft.com/office/word/2010/wordprocessingCanvas" xmlns:cx="http://schemas.microsoft.com/office/drawing/2014/chartex" xmlns:cx1="http://schemas.microsoft.com/office/drawing/2015/9/8/chartex" xmlns:cx2="http://schemas.microsoft.com/office/drawing/2015/10/21/chartex" xmlns:cx3="http://schemas.microsoft.com/office/drawing/2016/5/9/chartex" xmlns:cx4="http://schemas.microsoft.com/office/drawing/2016/5/10/chartex" xmlns:cx5="http://schemas.microsoft.com/office/drawing/2016/5/11/chartex" xmlns:cx6="http://schemas.microsoft.com/office/drawing/2016/5/12/chartex" xmlns:cx7="http://schemas.microsoft.com/office/drawing/2016/5/13/chartex" xmlns:cx8="http://schemas.microsoft.com/office/drawing/2016/5/14/chartex" xmlns:mc="http://schemas.openxmlformats.org/markup-compatibility/2006" xmlns:aink="http://schemas.microsoft.com/office/drawing/2016/ink" xmlns:am3d="http://schemas.microsoft.com/office/drawing/2017/model3d" xmlns:o="urn:schemas-microsoft-com:office:office" xmlns:oel="http://schemas.microsoft.com/office/2019/extlst" xmlns:r="http://schemas.openxmlformats.org/officeDocument/2006/relationships" xmlns:m="http://schemas.openxmlformats.org/officeDocument/2006/math" xmlns:v="urn:schemas-microsoft-com:vml" xmlns:wp14="http://schemas.microsoft.com/office/word/2010/wordprocessingDrawing" xmlns:wp="http://schemas.openxmlformats.org/drawingml/2006/wordprocessingDrawing" xmlns:w10="urn:schemas-microsoft-com:office:word" xmlns:w="http://schemas.openxmlformats.org/wordprocessingml/2006/main" xmlns:w14="http://schemas.microsoft.com/office/word/2010/wordml" xmlns:w15="http://schemas.microsoft.com/office/word/2012/wordml" xmlns:w16cex="http://schemas.microsoft.com/office/word/2018/wordml/cex" xmlns:w16cid="http://schemas.microsoft.com/office/word/2016/wordml/cid" xmlns:w16="http://schemas.microsoft.com/office/word/2018/wordml" xmlns:w16du="http://schemas.microsoft.com/office/word/2023/wordml/word16du" xmlns:w16sdtdh="http://schemas.microsoft.com/office/word/2020/wordml/sdtdatahash" xmlns:w16sdtfl="http://schemas.microsoft.com/office/word/2024/wordml/sdtformatlock" xmlns:w16se="http://schemas.microsoft.com/office/word/2015/wordml/symex" xmlns:wpg="http://schemas.microsoft.com/office/word/2010/wordprocessingGroup" xmlns:wpi="http://schemas.microsoft.com/office/word/2010/wordprocessingInk" xmlns:wne="http://schemas.microsoft.com/office/word/2006/wordml" xmlns:wps="http://schemas.microsoft.com/office/word/2010/wordprocessingShape" mc:Ignorable="w14 w15 w16se w16cid w16 w16cex w16sdtdh w16sdtfl w16du wp14">
   <w:abstractNum w:abstractNumId="0" w15:restartNumberingAfterBreak="0">
     <w:nsid w:val="01EE3AAF"/>
     <w:multiLevelType w:val="hybridMultilevel"/>
@@ -1772,16 +1704,8 @@
 </w:numbering>
 </file>
 
-<file path=word/people.xml><?xml version="1.0" encoding="utf-8"?>
-<w15:people xmlns:mc="http://schemas.openxmlformats.org/markup-compatibility/2006" xmlns:w15="http://schemas.microsoft.com/office/word/2012/wordml" xmlns:w14="http://schemas.microsoft.com/office/word/2010/wordml" xmlns:w16se="http://schemas.microsoft.com/office/word/2015/wordml/symex" xmlns:w16cid="http://schemas.microsoft.com/office/word/2016/wordml/cid" xmlns:w16="http://schemas.microsoft.com/office/word/2018/wordml" xmlns:w16cex="http://schemas.microsoft.com/office/word/2018/wordml/cex" xmlns:w16sdtdh="http://schemas.microsoft.com/office/word/2020/wordml/sdtdatahash" xmlns:w16sdtfl="http://schemas.microsoft.com/office/word/2024/wordml/sdtformatlock" xmlns:w16du="http://schemas.microsoft.com/office/word/2023/wordml/word16du" xmlns:wp14="http://schemas.microsoft.com/office/word/2010/wordprocessingDrawing" mc:Ignorable="w14 w15 w16se w16cid w16 w16cex w16sdtdh w16sdtfl w16du wp14">
-  <w15:person w15:author="s s">
-    <w15:presenceInfo w15:providerId="Windows Live" w15:userId="6bd97d7f750e84bb"/>
-  </w15:person>
-</w15:people>
-</file>
-
 <file path=word/styles.xml><?xml version="1.0" encoding="utf-8"?>
-<w:styles xmlns:mc="http://schemas.openxmlformats.org/markup-compatibility/2006" xmlns:w="http://schemas.openxmlformats.org/wordprocessingml/2006/main" xmlns:w14="http://schemas.microsoft.com/office/word/2010/wordml" xmlns:w15="http://schemas.microsoft.com/office/word/2012/wordml" xmlns:w16se="http://schemas.microsoft.com/office/word/2015/wordml/symex" xmlns:w16cid="http://schemas.microsoft.com/office/word/2016/wordml/cid" xmlns:w16="http://schemas.microsoft.com/office/word/2018/wordml" xmlns:w16cex="http://schemas.microsoft.com/office/word/2018/wordml/cex" xmlns:w16sdtdh="http://schemas.microsoft.com/office/word/2020/wordml/sdtdatahash" xmlns:w16sdtfl="http://schemas.microsoft.com/office/word/2024/wordml/sdtformatlock" xmlns:w16du="http://schemas.microsoft.com/office/word/2023/wordml/word16du" mc:Ignorable="w14 w15 w16se w16cid w16 w16cex w16sdtdh w16sdtfl w16du">
+<w:styles xmlns:mc="http://schemas.openxmlformats.org/markup-compatibility/2006" xmlns:r="http://schemas.openxmlformats.org/officeDocument/2006/relationships" xmlns:w="http://schemas.openxmlformats.org/wordprocessingml/2006/main" xmlns:w14="http://schemas.microsoft.com/office/word/2010/wordml" xmlns:w15="http://schemas.microsoft.com/office/word/2012/wordml" xmlns:w16cex="http://schemas.microsoft.com/office/word/2018/wordml/cex" xmlns:w16cid="http://schemas.microsoft.com/office/word/2016/wordml/cid" xmlns:w16="http://schemas.microsoft.com/office/word/2018/wordml" xmlns:w16du="http://schemas.microsoft.com/office/word/2023/wordml/word16du" xmlns:w16sdtdh="http://schemas.microsoft.com/office/word/2020/wordml/sdtdatahash" xmlns:w16sdtfl="http://schemas.microsoft.com/office/word/2024/wordml/sdtformatlock" xmlns:w16se="http://schemas.microsoft.com/office/word/2015/wordml/symex" mc:Ignorable="w14 w15 w16se w16cid w16 w16cex w16sdtdh w16sdtfl w16du">
   <w:docDefaults>
     <w:rPrDefault>
       <w:rPr>
@@ -2329,7 +2253,7 @@
 </file>
 
 <file path=word/theme/theme1.xml><?xml version="1.0" encoding="utf-8"?>
-<a:theme xmlns:a="http://schemas.openxmlformats.org/drawingml/2006/main" xmlns:ns1="http://schemas.microsoft.com/office/thememl/2012/main" name="Office テーマ">
+<a:theme xmlns:a="http://schemas.openxmlformats.org/drawingml/2006/main" name="Office テーマ">
   <a:themeElements>
     <a:clrScheme name="Office">
       <a:dk1>
@@ -2617,7 +2541,7 @@
   <a:extraClrSchemeLst/>
   <a:extLst>
     <a:ext uri="{05A4C25C-085E-4340-85A3-A5531E510DB2}">
-      <ns1:themeFamily name="Office Theme" id="{62F939B6-93AF-4DB8-9C6B-D6C7DFDC589F}" vid="{4A3C46E8-61CC-4603-A589-7422A47A8E4A}"/>
+      <thm15:themeFamily xmlns:thm15="http://schemas.microsoft.com/office/thememl/2012/main" name="Office Theme" id="{62F939B6-93AF-4DB8-9C6B-D6C7DFDC589F}" vid="{4A3C46E8-61CC-4603-A589-7422A47A8E4A}"/>
     </a:ext>
   </a:extLst>
 </a:theme>

</xml_diff>